<commit_message>
Ruling 42: an arrow is not an equals sign — every arrow on a student page in Units 3 and 4 replaced by what it meant; rebuilt on kit 83cf462
Co-Authored-By: Claude Opus 5.5 <noreply@anthropic.com>
Claude-Session: https://claude.ai/code/session_015xYWeLUsuszQH6z7ADE9tj
</commit_message>
<xml_diff>
--- a/a7/build/out/u4/A7 Unit 4 Solving Problems with Rational Numbers - Reference Sheet.docx
+++ b/a7/build/out/u4/A7 Unit 4 Solving Problems with Rational Numbers - Reference Sheet.docx
@@ -1243,7 +1243,7 @@
             <w:r>
               <w:drawing>
                 <wp:inline xmlns:a="http://schemas.openxmlformats.org/drawingml/2006/main" xmlns:pic="http://schemas.openxmlformats.org/drawingml/2006/picture">
-                  <wp:extent cx="649224" cy="137160"/>
+                  <wp:extent cx="362712" cy="137160"/>
                   <wp:docPr id="5" name="Picture 5"/>
                   <wp:cNvGraphicFramePr>
                     <a:graphicFrameLocks noChangeAspect="1"/>
@@ -1252,7 +1252,7 @@
                     <a:graphicData uri="http://schemas.openxmlformats.org/drawingml/2006/picture">
                       <pic:pic>
                         <pic:nvPicPr>
-                          <pic:cNvPr id="0" name="96b0bf0a81d810fe.png"/>
+                          <pic:cNvPr id="0" name="3bc741f433cae4a1.png"/>
                           <pic:cNvPicPr/>
                         </pic:nvPicPr>
                         <pic:blipFill>
@@ -1264,7 +1264,7 @@
                         <pic:spPr>
                           <a:xfrm>
                             <a:off x="0" y="0"/>
-                            <a:ext cx="649224" cy="137160"/>
+                            <a:ext cx="362712" cy="137160"/>
                           </a:xfrm>
                           <a:prstGeom prst="rect"/>
                         </pic:spPr>
@@ -1273,6 +1273,15 @@
                   </a:graphic>
                 </wp:inline>
               </w:drawing>
+            </w:r>
+            <w:r>
+              <w:rPr>
+                <w:b w:val="0"/>
+                <w:i w:val="0"/>
+                <w:color w:val="1A1A1A"/>
+                <w:sz w:val="21"/>
+              </w:rPr>
+              <w:t xml:space="preserve"> has 4</w:t>
             </w:r>
           </w:p>
         </w:tc>
@@ -1369,7 +1378,7 @@
             <w:r>
               <w:drawing>
                 <wp:inline xmlns:a="http://schemas.openxmlformats.org/drawingml/2006/main" xmlns:pic="http://schemas.openxmlformats.org/drawingml/2006/picture">
-                  <wp:extent cx="804672" cy="118872"/>
+                  <wp:extent cx="521207" cy="118872"/>
                   <wp:docPr id="6" name="Picture 6"/>
                   <wp:cNvGraphicFramePr>
                     <a:graphicFrameLocks noChangeAspect="1"/>
@@ -1378,7 +1387,7 @@
                     <a:graphicData uri="http://schemas.openxmlformats.org/drawingml/2006/picture">
                       <pic:pic>
                         <pic:nvPicPr>
-                          <pic:cNvPr id="0" name="3a93420b16a67616.png"/>
+                          <pic:cNvPr id="0" name="f0ac9a4364b7faf1.png"/>
                           <pic:cNvPicPr/>
                         </pic:nvPicPr>
                         <pic:blipFill>
@@ -1390,7 +1399,7 @@
                         <pic:spPr>
                           <a:xfrm>
                             <a:off x="0" y="0"/>
-                            <a:ext cx="804672" cy="118872"/>
+                            <a:ext cx="521207" cy="118872"/>
                           </a:xfrm>
                           <a:prstGeom prst="rect"/>
                         </pic:spPr>
@@ -1399,6 +1408,15 @@
                   </a:graphic>
                 </wp:inline>
               </w:drawing>
+            </w:r>
+            <w:r>
+              <w:rPr>
+                <w:b w:val="0"/>
+                <w:i w:val="0"/>
+                <w:color w:val="1A1A1A"/>
+                <w:sz w:val="21"/>
+              </w:rPr>
+              <w:t xml:space="preserve"> has 3</w:t>
             </w:r>
           </w:p>
         </w:tc>
@@ -1495,7 +1513,7 @@
             <w:r>
               <w:drawing>
                 <wp:inline xmlns:a="http://schemas.openxmlformats.org/drawingml/2006/main" xmlns:pic="http://schemas.openxmlformats.org/drawingml/2006/picture">
-                  <wp:extent cx="728472" cy="118872"/>
+                  <wp:extent cx="438912" cy="118872"/>
                   <wp:docPr id="7" name="Picture 7"/>
                   <wp:cNvGraphicFramePr>
                     <a:graphicFrameLocks noChangeAspect="1"/>
@@ -1504,7 +1522,7 @@
                     <a:graphicData uri="http://schemas.openxmlformats.org/drawingml/2006/picture">
                       <pic:pic>
                         <pic:nvPicPr>
-                          <pic:cNvPr id="0" name="87275bcc3d3ebdde.png"/>
+                          <pic:cNvPr id="0" name="d55d75f20443bf78.png"/>
                           <pic:cNvPicPr/>
                         </pic:nvPicPr>
                         <pic:blipFill>
@@ -1516,7 +1534,7 @@
                         <pic:spPr>
                           <a:xfrm>
                             <a:off x="0" y="0"/>
-                            <a:ext cx="728472" cy="118872"/>
+                            <a:ext cx="438912" cy="118872"/>
                           </a:xfrm>
                           <a:prstGeom prst="rect"/>
                         </pic:spPr>
@@ -1525,6 +1543,15 @@
                   </a:graphic>
                 </wp:inline>
               </w:drawing>
+            </w:r>
+            <w:r>
+              <w:rPr>
+                <w:b w:val="0"/>
+                <w:i w:val="0"/>
+                <w:color w:val="1A1A1A"/>
+                <w:sz w:val="21"/>
+              </w:rPr>
+              <w:t xml:space="preserve"> has 2</w:t>
             </w:r>
           </w:p>
         </w:tc>
@@ -1621,7 +1648,7 @@
             <w:r>
               <w:drawing>
                 <wp:inline xmlns:a="http://schemas.openxmlformats.org/drawingml/2006/main" xmlns:pic="http://schemas.openxmlformats.org/drawingml/2006/picture">
-                  <wp:extent cx="643128" cy="115824"/>
+                  <wp:extent cx="359664" cy="115824"/>
                   <wp:docPr id="8" name="Picture 8"/>
                   <wp:cNvGraphicFramePr>
                     <a:graphicFrameLocks noChangeAspect="1"/>
@@ -1630,7 +1657,7 @@
                     <a:graphicData uri="http://schemas.openxmlformats.org/drawingml/2006/picture">
                       <pic:pic>
                         <pic:nvPicPr>
-                          <pic:cNvPr id="0" name="ed5f08a179c262af.png"/>
+                          <pic:cNvPr id="0" name="b0e1583c68c1da0b.png"/>
                           <pic:cNvPicPr/>
                         </pic:nvPicPr>
                         <pic:blipFill>
@@ -1642,7 +1669,7 @@
                         <pic:spPr>
                           <a:xfrm>
                             <a:off x="0" y="0"/>
-                            <a:ext cx="643128" cy="115824"/>
+                            <a:ext cx="359664" cy="115824"/>
                           </a:xfrm>
                           <a:prstGeom prst="rect"/>
                         </pic:spPr>
@@ -1651,6 +1678,15 @@
                   </a:graphic>
                 </wp:inline>
               </w:drawing>
+            </w:r>
+            <w:r>
+              <w:rPr>
+                <w:b w:val="0"/>
+                <w:i w:val="0"/>
+                <w:color w:val="1A1A1A"/>
+                <w:sz w:val="21"/>
+              </w:rPr>
+              <w:t xml:space="preserve"> has 4</w:t>
             </w:r>
           </w:p>
         </w:tc>
@@ -1745,7 +1781,7 @@
             <w:r>
               <w:drawing>
                 <wp:inline xmlns:a="http://schemas.openxmlformats.org/drawingml/2006/main" xmlns:pic="http://schemas.openxmlformats.org/drawingml/2006/picture">
-                  <wp:extent cx="728472" cy="140208"/>
+                  <wp:extent cx="445008" cy="140208"/>
                   <wp:docPr id="9" name="Picture 9"/>
                   <wp:cNvGraphicFramePr>
                     <a:graphicFrameLocks noChangeAspect="1"/>
@@ -1754,7 +1790,7 @@
                     <a:graphicData uri="http://schemas.openxmlformats.org/drawingml/2006/picture">
                       <pic:pic>
                         <pic:nvPicPr>
-                          <pic:cNvPr id="0" name="b3ea2fb789c0448a.png"/>
+                          <pic:cNvPr id="0" name="134e2fc91f43fb06.png"/>
                           <pic:cNvPicPr/>
                         </pic:nvPicPr>
                         <pic:blipFill>
@@ -1766,7 +1802,7 @@
                         <pic:spPr>
                           <a:xfrm>
                             <a:off x="0" y="0"/>
-                            <a:ext cx="728472" cy="140208"/>
+                            <a:ext cx="445008" cy="140208"/>
                           </a:xfrm>
                           <a:prstGeom prst="rect"/>
                         </pic:spPr>
@@ -1775,6 +1811,15 @@
                   </a:graphic>
                 </wp:inline>
               </w:drawing>
+            </w:r>
+            <w:r>
+              <w:rPr>
+                <w:b w:val="0"/>
+                <w:i w:val="0"/>
+                <w:color w:val="1A1A1A"/>
+                <w:sz w:val="21"/>
+              </w:rPr>
+              <w:t xml:space="preserve"> has 2</w:t>
             </w:r>
           </w:p>
         </w:tc>

</xml_diff>